<commit_message>
Carta medassure: saludo y redacción neutros en cuanto a género
Co-Authored-By: Claude Opus 5.5 <noreply@anthropic.com>
Claude-Session: https://claude.ai/code/session_01ELUfjYdP6cK41JV9hkADwe
</commit_message>
<xml_diff>
--- a/medassure_beauty_Carta_clientes_ES.docx
+++ b/medassure_beauty_Carta_clientes_ES.docx
@@ -263,7 +263,7 @@
           <w:sz w:val="22"/>
           <w:szCs w:val="22"/>
         </w:rPr>
-        <w:t xml:space="preserve">Estimados señores:</w:t>
+        <w:t xml:space="preserve">Estimado equipo:</w:t>
       </w:r>
     </w:p>
     <w:p>
@@ -321,7 +321,7 @@
           <w:sz w:val="22"/>
           <w:szCs w:val="22"/>
         </w:rPr>
-        <w:t xml:space="preserve">En los últimos años, el coste de tratar las complicaciones tras una operación estética ha aumentado considerablemente, sobre todo en estancias hospitalarias, reintervenciones, personal y material. Para mantener la calidad de las prestaciones y de la gestión de siniestros a la que están acostumbrados, ajustamos ligeramente nuestras primas por primera vez en ocho años. Se mantienen las primas únicas para 1, 2 o 5 años. Los contratos en vigor siguen sin cambios hasta su vencimiento.</w:t>
+        <w:t xml:space="preserve">En los últimos años, el coste de tratar las complicaciones tras una operación estética ha aumentado considerablemente, sobre todo en estancias hospitalarias, reintervenciones, personal y material. Para mantener la calidad habitual de las prestaciones y de la gestión de siniestros, ajustamos ligeramente nuestras primas por primera vez en ocho años. Se mantienen las primas únicas para 1, 2 o 5 años. Los contratos en vigor siguen sin cambios hasta su vencimiento.</w:t>
       </w:r>
     </w:p>
     <w:p>

</xml_diff>

<commit_message>
Carta medassure beauty: solo contratación directa por el paciente y estilo más natural
- Se quita la opción de altas por Excel; el paciente contrata con el formulario
  o en línea en medassure.es.
- Redacción más cercana al estilo anterior, sin dos puntos en títulos y frases.
- Espacio indivisible antes de € y % para que los importes no se partan.

Co-Authored-By: Claude Opus 5.5 <noreply@anthropic.com>
Claude-Session: https://claude.ai/code/session_01BbVdXybygTjqWXzNsPXUcQ
</commit_message>
<xml_diff>
--- a/medassure_beauty_Carta_clientes_ES.docx
+++ b/medassure_beauty_Carta_clientes_ES.docx
@@ -250,7 +250,7 @@
           <w:sz w:val="32"/>
           <w:szCs w:val="32"/>
         </w:rPr>
-        <w:t xml:space="preserve">medassure beauty: nuevas tarifas y nuevo modelo de contratación</w:t>
+        <w:t xml:space="preserve">Nuevas tarifas de medassure beauty y nueva forma de contratar el seguro</w:t>
       </w:r>
     </w:p>
     <w:p>
@@ -276,7 +276,7 @@
           <w:sz w:val="22"/>
           <w:szCs w:val="22"/>
         </w:rPr>
-        <w:t xml:space="preserve">Les agradecemos la confianza depositada en nuestra colaboración. Hemos revisado medassure beauty: incorporamos la tarifa Premium, ajustamos la tabla de indemnizaciones, subimos ligeramente las primas y cambiamos el modelo de contratación. A continuación les resumimos qué supone para su clínica.</w:t>
+        <w:t xml:space="preserve">Les agradecemos la confianza depositada en nuestra colaboración y les informamos de algunas novedades de medassure beauty. Incorporamos la nueva tarifa Premium, ajustamos la tabla de indemnizaciones y las primas, y cambiamos la forma de contratar el seguro.</w:t>
       </w:r>
     </w:p>
     <w:tbl>
@@ -352,7 +352,7 @@
                 <w:sz w:val="22"/>
                 <w:szCs w:val="22"/>
               </w:rPr>
-              <w:t xml:space="preserve"> Desde esa fecha podrán elegir, en cada caso, entre las dos opciones del apartado 1.</w:t>
+              <w:t xml:space="preserve"> Desde esa fecha, sus pacientes contratarán el seguro directamente con nosotros.</w:t>
             </w:r>
           </w:p>
         </w:tc>
@@ -392,7 +392,21 @@
           <w:sz w:val="26"/>
           <w:szCs w:val="26"/>
         </w:rPr>
-        <w:t xml:space="preserve">Cómo asegurar a sus pacientes desde el 1 de enero de 2027</w:t>
+        <w:t xml:space="preserve">El paciente contrata el seguro directamente</w:t>
+      </w:r>
+    </w:p>
+    <w:p>
+      <w:pPr>
+        <w:keepNext/>
+        <w:spacing w:after="140" w:line="276"/>
+      </w:pPr>
+      <w:r>
+        <w:rPr>
+          <w:rFonts w:ascii="Calibri" w:cs="Calibri" w:eastAsia="Calibri" w:hAnsi="Calibri"/>
+          <w:sz w:val="22"/>
+          <w:szCs w:val="22"/>
+        </w:rPr>
+        <w:t xml:space="preserve">A partir del 1 de enero de 2027, cada paciente contrata su propio seguro de complicaciones. Puede hacerlo de dos maneras.</w:t>
       </w:r>
     </w:p>
     <w:p>
@@ -409,13 +423,12 @@
           <w:sz w:val="22"/>
           <w:szCs w:val="22"/>
         </w:rPr>
-        <w:t xml:space="preserve">Opción 1: la clínica sigue enviando las altas por Excel</w:t>
+        <w:t xml:space="preserve">Con el formulario de solicitud</w:t>
       </w:r>
     </w:p>
     <w:p>
       <w:pPr>
-        <w:keepNext/>
-        <w:spacing w:after="100" w:line="276"/>
+        <w:spacing w:after="140" w:line="276"/>
       </w:pPr>
       <w:r>
         <w:rPr>
@@ -423,570 +436,13 @@
           <w:sz w:val="22"/>
           <w:szCs w:val="22"/>
         </w:rPr>
-        <w:t xml:space="preserve">Funciona como hasta ahora, con el nuevo Excel adjunto y estos cambios:</w:t>
-      </w:r>
-    </w:p>
-    <w:tbl>
-      <w:tblPr>
-        <w:tblW w:type="dxa" w:w="9906"/>
-        <w:tblLayout w:type="fixed"/>
-      </w:tblPr>
-      <w:tblGrid>
-        <w:gridCol w:w="2606"/>
-        <w:gridCol w:w="3300"/>
-        <w:gridCol w:w="4000"/>
-      </w:tblGrid>
-      <w:tr>
-        <w:trPr>
-          <w:cantSplit/>
-          <w:tblHeader/>
-        </w:trPr>
-        <w:tc>
-          <w:tcPr>
-            <w:tcW w:type="dxa" w:w="2606"/>
-            <w:tcBorders>
-              <w:top w:val="single" w:color="D6E6F3" w:sz="4"/>
-              <w:left w:val="none" w:color="FFFFFF" w:sz="0"/>
-              <w:bottom w:val="single" w:color="D6E6F3" w:sz="4"/>
-              <w:right w:val="none" w:color="FFFFFF" w:sz="0"/>
-            </w:tcBorders>
-            <w:shd w:fill="1F3B5C" w:color="auto" w:val="clear"/>
-            <w:tcMar>
-              <w:top w:type="dxa" w:w="70"/>
-              <w:left w:type="dxa" w:w="120"/>
-              <w:bottom w:type="dxa" w:w="70"/>
-              <w:right w:type="dxa" w:w="120"/>
-            </w:tcMar>
-            <w:vAlign w:val="center"/>
-          </w:tcPr>
-          <w:p>
-            <w:pPr>
-              <w:keepNext/>
-              <w:jc w:val="left"/>
-            </w:pPr>
-            <w:r>
-              <w:rPr>
-                <w:rFonts w:ascii="Calibri" w:cs="Calibri" w:eastAsia="Calibri" w:hAnsi="Calibri"/>
-                <w:b/>
-                <w:bCs/>
-                <w:color w:val="FFFFFF"/>
-                <w:sz w:val="20"/>
-                <w:szCs w:val="20"/>
-              </w:rPr>
-              <w:t xml:space="preserve"/>
-            </w:r>
-          </w:p>
-        </w:tc>
-        <w:tc>
-          <w:tcPr>
-            <w:tcW w:type="dxa" w:w="3300"/>
-            <w:tcBorders>
-              <w:top w:val="single" w:color="D6E6F3" w:sz="4"/>
-              <w:left w:val="none" w:color="FFFFFF" w:sz="0"/>
-              <w:bottom w:val="single" w:color="D6E6F3" w:sz="4"/>
-              <w:right w:val="none" w:color="FFFFFF" w:sz="0"/>
-            </w:tcBorders>
-            <w:shd w:fill="1F3B5C" w:color="auto" w:val="clear"/>
-            <w:tcMar>
-              <w:top w:type="dxa" w:w="70"/>
-              <w:left w:type="dxa" w:w="120"/>
-              <w:bottom w:type="dxa" w:w="70"/>
-              <w:right w:type="dxa" w:w="120"/>
-            </w:tcMar>
-            <w:vAlign w:val="center"/>
-          </w:tcPr>
-          <w:p>
-            <w:pPr>
-              <w:keepNext/>
-              <w:jc w:val="left"/>
-            </w:pPr>
-            <w:r>
-              <w:rPr>
-                <w:rFonts w:ascii="Calibri" w:cs="Calibri" w:eastAsia="Calibri" w:hAnsi="Calibri"/>
-                <w:b/>
-                <w:bCs/>
-                <w:color w:val="FFFFFF"/>
-                <w:sz w:val="20"/>
-                <w:szCs w:val="20"/>
-              </w:rPr>
-              <w:t xml:space="preserve">Hasta ahora</w:t>
-            </w:r>
-          </w:p>
-        </w:tc>
-        <w:tc>
-          <w:tcPr>
-            <w:tcW w:type="dxa" w:w="4000"/>
-            <w:tcBorders>
-              <w:top w:val="single" w:color="D6E6F3" w:sz="4"/>
-              <w:left w:val="none" w:color="FFFFFF" w:sz="0"/>
-              <w:bottom w:val="single" w:color="D6E6F3" w:sz="4"/>
-              <w:right w:val="none" w:color="FFFFFF" w:sz="0"/>
-            </w:tcBorders>
-            <w:shd w:fill="1F3B5C" w:color="auto" w:val="clear"/>
-            <w:tcMar>
-              <w:top w:type="dxa" w:w="70"/>
-              <w:left w:type="dxa" w:w="120"/>
-              <w:bottom w:type="dxa" w:w="70"/>
-              <w:right w:type="dxa" w:w="120"/>
-            </w:tcMar>
-            <w:vAlign w:val="center"/>
-          </w:tcPr>
-          <w:p>
-            <w:pPr>
-              <w:keepNext/>
-              <w:jc w:val="left"/>
-            </w:pPr>
-            <w:r>
-              <w:rPr>
-                <w:rFonts w:ascii="Calibri" w:cs="Calibri" w:eastAsia="Calibri" w:hAnsi="Calibri"/>
-                <w:b/>
-                <w:bCs/>
-                <w:color w:val="FFFFFF"/>
-                <w:sz w:val="20"/>
-                <w:szCs w:val="20"/>
-              </w:rPr>
-              <w:t xml:space="preserve">Desde el 1 de enero de 2027</w:t>
-            </w:r>
-          </w:p>
-        </w:tc>
-      </w:tr>
-      <w:tr>
-        <w:trPr>
-          <w:cantSplit/>
-        </w:trPr>
-        <w:tc>
-          <w:tcPr>
-            <w:tcW w:type="dxa" w:w="2606"/>
-            <w:tcBorders>
-              <w:top w:val="single" w:color="D6E6F3" w:sz="4"/>
-              <w:left w:val="none" w:color="FFFFFF" w:sz="0"/>
-              <w:bottom w:val="single" w:color="D6E6F3" w:sz="4"/>
-              <w:right w:val="none" w:color="FFFFFF" w:sz="0"/>
-            </w:tcBorders>
-            <w:tcMar>
-              <w:top w:type="dxa" w:w="70"/>
-              <w:left w:type="dxa" w:w="120"/>
-              <w:bottom w:type="dxa" w:w="70"/>
-              <w:right w:type="dxa" w:w="120"/>
-            </w:tcMar>
-            <w:vAlign w:val="center"/>
-          </w:tcPr>
-          <w:p>
-            <w:pPr>
-              <w:keepNext/>
-              <w:jc w:val="left"/>
-            </w:pPr>
-            <w:r>
-              <w:rPr>
-                <w:rFonts w:ascii="Calibri" w:cs="Calibri" w:eastAsia="Calibri" w:hAnsi="Calibri"/>
-                <w:b/>
-                <w:bCs/>
-                <w:color w:val="1F3B5C"/>
-                <w:sz w:val="20"/>
-                <w:szCs w:val="20"/>
-              </w:rPr>
-              <w:t xml:space="preserve">Envío de altas</w:t>
-            </w:r>
-          </w:p>
-        </w:tc>
-        <w:tc>
-          <w:tcPr>
-            <w:tcW w:type="dxa" w:w="3300"/>
-            <w:tcBorders>
-              <w:top w:val="single" w:color="D6E6F3" w:sz="4"/>
-              <w:left w:val="none" w:color="FFFFFF" w:sz="0"/>
-              <w:bottom w:val="single" w:color="D6E6F3" w:sz="4"/>
-              <w:right w:val="none" w:color="FFFFFF" w:sz="0"/>
-            </w:tcBorders>
-            <w:tcMar>
-              <w:top w:type="dxa" w:w="70"/>
-              <w:left w:type="dxa" w:w="120"/>
-              <w:bottom w:type="dxa" w:w="70"/>
-              <w:right w:type="dxa" w:w="120"/>
-            </w:tcMar>
-            <w:vAlign w:val="center"/>
-          </w:tcPr>
-          <w:p>
-            <w:pPr>
-              <w:keepNext/>
-              <w:jc w:val="left"/>
-            </w:pPr>
-            <w:r>
-              <w:rPr>
-                <w:rFonts w:ascii="Calibri" w:cs="Calibri" w:eastAsia="Calibri" w:hAnsi="Calibri"/>
-                <w:color w:val="222222"/>
-                <w:sz w:val="20"/>
-                <w:szCs w:val="20"/>
-              </w:rPr>
-              <w:t xml:space="preserve">Por Excel</w:t>
-            </w:r>
-          </w:p>
-        </w:tc>
-        <w:tc>
-          <w:tcPr>
-            <w:tcW w:type="dxa" w:w="4000"/>
-            <w:tcBorders>
-              <w:top w:val="single" w:color="D6E6F3" w:sz="4"/>
-              <w:left w:val="none" w:color="FFFFFF" w:sz="0"/>
-              <w:bottom w:val="single" w:color="D6E6F3" w:sz="4"/>
-              <w:right w:val="none" w:color="FFFFFF" w:sz="0"/>
-            </w:tcBorders>
-            <w:tcMar>
-              <w:top w:type="dxa" w:w="70"/>
-              <w:left w:type="dxa" w:w="120"/>
-              <w:bottom w:type="dxa" w:w="70"/>
-              <w:right w:type="dxa" w:w="120"/>
-            </w:tcMar>
-            <w:vAlign w:val="center"/>
-          </w:tcPr>
-          <w:p>
-            <w:pPr>
-              <w:keepNext/>
-              <w:jc w:val="left"/>
-            </w:pPr>
-            <w:r>
-              <w:rPr>
-                <w:rFonts w:ascii="Calibri" w:cs="Calibri" w:eastAsia="Calibri" w:hAnsi="Calibri"/>
-                <w:color w:val="222222"/>
-                <w:sz w:val="20"/>
-                <w:szCs w:val="20"/>
-              </w:rPr>
-              <w:t xml:space="preserve">Por Excel, indicando el IBAN de la clínica</w:t>
-            </w:r>
-          </w:p>
-        </w:tc>
-      </w:tr>
-      <w:tr>
-        <w:trPr>
-          <w:cantSplit/>
-        </w:trPr>
-        <w:tc>
-          <w:tcPr>
-            <w:tcW w:type="dxa" w:w="2606"/>
-            <w:tcBorders>
-              <w:top w:val="single" w:color="D6E6F3" w:sz="4"/>
-              <w:left w:val="none" w:color="FFFFFF" w:sz="0"/>
-              <w:bottom w:val="single" w:color="D6E6F3" w:sz="4"/>
-              <w:right w:val="none" w:color="FFFFFF" w:sz="0"/>
-            </w:tcBorders>
-            <w:shd w:fill="EAF4FC" w:color="auto" w:val="clear"/>
-            <w:tcMar>
-              <w:top w:type="dxa" w:w="70"/>
-              <w:left w:type="dxa" w:w="120"/>
-              <w:bottom w:type="dxa" w:w="70"/>
-              <w:right w:type="dxa" w:w="120"/>
-            </w:tcMar>
-            <w:vAlign w:val="center"/>
-          </w:tcPr>
-          <w:p>
-            <w:pPr>
-              <w:keepNext/>
-              <w:jc w:val="left"/>
-            </w:pPr>
-            <w:r>
-              <w:rPr>
-                <w:rFonts w:ascii="Calibri" w:cs="Calibri" w:eastAsia="Calibri" w:hAnsi="Calibri"/>
-                <w:b/>
-                <w:bCs/>
-                <w:color w:val="1F3B5C"/>
-                <w:sz w:val="20"/>
-                <w:szCs w:val="20"/>
-              </w:rPr>
-              <w:t xml:space="preserve">Cobro de la prima</w:t>
-            </w:r>
-          </w:p>
-        </w:tc>
-        <w:tc>
-          <w:tcPr>
-            <w:tcW w:type="dxa" w:w="3300"/>
-            <w:tcBorders>
-              <w:top w:val="single" w:color="D6E6F3" w:sz="4"/>
-              <w:left w:val="none" w:color="FFFFFF" w:sz="0"/>
-              <w:bottom w:val="single" w:color="D6E6F3" w:sz="4"/>
-              <w:right w:val="none" w:color="FFFFFF" w:sz="0"/>
-            </w:tcBorders>
-            <w:shd w:fill="EAF4FC" w:color="auto" w:val="clear"/>
-            <w:tcMar>
-              <w:top w:type="dxa" w:w="70"/>
-              <w:left w:type="dxa" w:w="120"/>
-              <w:bottom w:type="dxa" w:w="70"/>
-              <w:right w:type="dxa" w:w="120"/>
-            </w:tcMar>
-            <w:vAlign w:val="center"/>
-          </w:tcPr>
-          <w:p>
-            <w:pPr>
-              <w:keepNext/>
-              <w:jc w:val="left"/>
-            </w:pPr>
-            <w:r>
-              <w:rPr>
-                <w:rFonts w:ascii="Calibri" w:cs="Calibri" w:eastAsia="Calibri" w:hAnsi="Calibri"/>
-                <w:color w:val="222222"/>
-                <w:sz w:val="20"/>
-                <w:szCs w:val="20"/>
-              </w:rPr>
-              <w:t xml:space="preserve">Facturación mensual</w:t>
-            </w:r>
-          </w:p>
-        </w:tc>
-        <w:tc>
-          <w:tcPr>
-            <w:tcW w:type="dxa" w:w="4000"/>
-            <w:tcBorders>
-              <w:top w:val="single" w:color="D6E6F3" w:sz="4"/>
-              <w:left w:val="none" w:color="FFFFFF" w:sz="0"/>
-              <w:bottom w:val="single" w:color="D6E6F3" w:sz="4"/>
-              <w:right w:val="none" w:color="FFFFFF" w:sz="0"/>
-            </w:tcBorders>
-            <w:shd w:fill="EAF4FC" w:color="auto" w:val="clear"/>
-            <w:tcMar>
-              <w:top w:type="dxa" w:w="70"/>
-              <w:left w:type="dxa" w:w="120"/>
-              <w:bottom w:type="dxa" w:w="70"/>
-              <w:right w:type="dxa" w:w="120"/>
-            </w:tcMar>
-            <w:vAlign w:val="center"/>
-          </w:tcPr>
-          <w:p>
-            <w:pPr>
-              <w:keepNext/>
-              <w:jc w:val="left"/>
-            </w:pPr>
-            <w:r>
-              <w:rPr>
-                <w:rFonts w:ascii="Calibri" w:cs="Calibri" w:eastAsia="Calibri" w:hAnsi="Calibri"/>
-                <w:color w:val="222222"/>
-                <w:sz w:val="20"/>
-                <w:szCs w:val="20"/>
-              </w:rPr>
-              <w:t xml:space="preserve">Cargo en la cuenta de la clínica en un máximo de 3 días</w:t>
-            </w:r>
-          </w:p>
-        </w:tc>
-      </w:tr>
-      <w:tr>
-        <w:trPr>
-          <w:cantSplit/>
-        </w:trPr>
-        <w:tc>
-          <w:tcPr>
-            <w:tcW w:type="dxa" w:w="2606"/>
-            <w:tcBorders>
-              <w:top w:val="single" w:color="D6E6F3" w:sz="4"/>
-              <w:left w:val="none" w:color="FFFFFF" w:sz="0"/>
-              <w:bottom w:val="single" w:color="D6E6F3" w:sz="4"/>
-              <w:right w:val="none" w:color="FFFFFF" w:sz="0"/>
-            </w:tcBorders>
-            <w:tcMar>
-              <w:top w:type="dxa" w:w="70"/>
-              <w:left w:type="dxa" w:w="120"/>
-              <w:bottom w:type="dxa" w:w="70"/>
-              <w:right w:type="dxa" w:w="120"/>
-            </w:tcMar>
-            <w:vAlign w:val="center"/>
-          </w:tcPr>
-          <w:p>
-            <w:pPr>
-              <w:keepNext/>
-              <w:jc w:val="left"/>
-            </w:pPr>
-            <w:r>
-              <w:rPr>
-                <w:rFonts w:ascii="Calibri" w:cs="Calibri" w:eastAsia="Calibri" w:hAnsi="Calibri"/>
-                <w:b/>
-                <w:bCs/>
-                <w:color w:val="1F3B5C"/>
-                <w:sz w:val="20"/>
-                <w:szCs w:val="20"/>
-              </w:rPr>
-              <w:t xml:space="preserve">Plazo de envío</w:t>
-            </w:r>
-          </w:p>
-        </w:tc>
-        <w:tc>
-          <w:tcPr>
-            <w:tcW w:type="dxa" w:w="3300"/>
-            <w:tcBorders>
-              <w:top w:val="single" w:color="D6E6F3" w:sz="4"/>
-              <w:left w:val="none" w:color="FFFFFF" w:sz="0"/>
-              <w:bottom w:val="single" w:color="D6E6F3" w:sz="4"/>
-              <w:right w:val="none" w:color="FFFFFF" w:sz="0"/>
-            </w:tcBorders>
-            <w:tcMar>
-              <w:top w:type="dxa" w:w="70"/>
-              <w:left w:type="dxa" w:w="120"/>
-              <w:bottom w:type="dxa" w:w="70"/>
-              <w:right w:type="dxa" w:w="120"/>
-            </w:tcMar>
-            <w:vAlign w:val="center"/>
-          </w:tcPr>
-          <w:p>
-            <w:pPr>
-              <w:keepNext/>
-              <w:jc w:val="left"/>
-            </w:pPr>
-            <w:r>
-              <w:rPr>
-                <w:rFonts w:ascii="Calibri" w:cs="Calibri" w:eastAsia="Calibri" w:hAnsi="Calibri"/>
-                <w:color w:val="222222"/>
-                <w:sz w:val="20"/>
-                <w:szCs w:val="20"/>
-              </w:rPr>
-              <w:t xml:space="preserve">También después de la operación</w:t>
-            </w:r>
-          </w:p>
-        </w:tc>
-        <w:tc>
-          <w:tcPr>
-            <w:tcW w:type="dxa" w:w="4000"/>
-            <w:tcBorders>
-              <w:top w:val="single" w:color="D6E6F3" w:sz="4"/>
-              <w:left w:val="none" w:color="FFFFFF" w:sz="0"/>
-              <w:bottom w:val="single" w:color="D6E6F3" w:sz="4"/>
-              <w:right w:val="none" w:color="FFFFFF" w:sz="0"/>
-            </w:tcBorders>
-            <w:tcMar>
-              <w:top w:type="dxa" w:w="70"/>
-              <w:left w:type="dxa" w:w="120"/>
-              <w:bottom w:type="dxa" w:w="70"/>
-              <w:right w:type="dxa" w:w="120"/>
-            </w:tcMar>
-            <w:vAlign w:val="center"/>
-          </w:tcPr>
-          <w:p>
-            <w:pPr>
-              <w:keepNext/>
-              <w:jc w:val="left"/>
-            </w:pPr>
-            <w:r>
-              <w:rPr>
-                <w:rFonts w:ascii="Calibri" w:cs="Calibri" w:eastAsia="Calibri" w:hAnsi="Calibri"/>
-                <w:color w:val="222222"/>
-                <w:sz w:val="20"/>
-                <w:szCs w:val="20"/>
-              </w:rPr>
-              <w:t xml:space="preserve">Como mínimo 1 día antes de la operación</w:t>
-            </w:r>
-          </w:p>
-        </w:tc>
-      </w:tr>
-      <w:tr>
-        <w:trPr>
-          <w:cantSplit/>
-        </w:trPr>
-        <w:tc>
-          <w:tcPr>
-            <w:tcW w:type="dxa" w:w="2606"/>
-            <w:tcBorders>
-              <w:top w:val="single" w:color="D6E6F3" w:sz="4"/>
-              <w:left w:val="none" w:color="FFFFFF" w:sz="0"/>
-              <w:bottom w:val="single" w:color="D6E6F3" w:sz="4"/>
-              <w:right w:val="none" w:color="FFFFFF" w:sz="0"/>
-            </w:tcBorders>
-            <w:shd w:fill="EAF4FC" w:color="auto" w:val="clear"/>
-            <w:tcMar>
-              <w:top w:type="dxa" w:w="70"/>
-              <w:left w:type="dxa" w:w="120"/>
-              <w:bottom w:type="dxa" w:w="70"/>
-              <w:right w:type="dxa" w:w="120"/>
-            </w:tcMar>
-            <w:vAlign w:val="center"/>
-          </w:tcPr>
-          <w:p>
-            <w:pPr>
-              <w:jc w:val="left"/>
-            </w:pPr>
-            <w:r>
-              <w:rPr>
-                <w:rFonts w:ascii="Calibri" w:cs="Calibri" w:eastAsia="Calibri" w:hAnsi="Calibri"/>
-                <w:b/>
-                <w:bCs/>
-                <w:color w:val="1F3B5C"/>
-                <w:sz w:val="20"/>
-                <w:szCs w:val="20"/>
-              </w:rPr>
-              <w:t xml:space="preserve">Varios tratamientos</w:t>
-            </w:r>
-          </w:p>
-        </w:tc>
-        <w:tc>
-          <w:tcPr>
-            <w:tcW w:type="dxa" w:w="3300"/>
-            <w:tcBorders>
-              <w:top w:val="single" w:color="D6E6F3" w:sz="4"/>
-              <w:left w:val="none" w:color="FFFFFF" w:sz="0"/>
-              <w:bottom w:val="single" w:color="D6E6F3" w:sz="4"/>
-              <w:right w:val="none" w:color="FFFFFF" w:sz="0"/>
-            </w:tcBorders>
-            <w:shd w:fill="EAF4FC" w:color="auto" w:val="clear"/>
-            <w:tcMar>
-              <w:top w:type="dxa" w:w="70"/>
-              <w:left w:type="dxa" w:w="120"/>
-              <w:bottom w:type="dxa" w:w="70"/>
-              <w:right w:type="dxa" w:w="120"/>
-            </w:tcMar>
-            <w:vAlign w:val="center"/>
-          </w:tcPr>
-          <w:p>
-            <w:pPr>
-              <w:jc w:val="left"/>
-            </w:pPr>
-            <w:r>
-              <w:rPr>
-                <w:rFonts w:ascii="Calibri" w:cs="Calibri" w:eastAsia="Calibri" w:hAnsi="Calibri"/>
-                <w:color w:val="222222"/>
-                <w:sz w:val="20"/>
-                <w:szCs w:val="20"/>
-              </w:rPr>
-              <w:t xml:space="preserve">Sin recargo</w:t>
-            </w:r>
-          </w:p>
-        </w:tc>
-        <w:tc>
-          <w:tcPr>
-            <w:tcW w:type="dxa" w:w="4000"/>
-            <w:tcBorders>
-              <w:top w:val="single" w:color="D6E6F3" w:sz="4"/>
-              <w:left w:val="none" w:color="FFFFFF" w:sz="0"/>
-              <w:bottom w:val="single" w:color="D6E6F3" w:sz="4"/>
-              <w:right w:val="none" w:color="FFFFFF" w:sz="0"/>
-            </w:tcBorders>
-            <w:shd w:fill="EAF4FC" w:color="auto" w:val="clear"/>
-            <w:tcMar>
-              <w:top w:type="dxa" w:w="70"/>
-              <w:left w:type="dxa" w:w="120"/>
-              <w:bottom w:type="dxa" w:w="70"/>
-              <w:right w:type="dxa" w:w="120"/>
-            </w:tcMar>
-            <w:vAlign w:val="center"/>
-          </w:tcPr>
-          <w:p>
-            <w:pPr>
-              <w:jc w:val="left"/>
-            </w:pPr>
-            <w:r>
-              <w:rPr>
-                <w:rFonts w:ascii="Calibri" w:cs="Calibri" w:eastAsia="Calibri" w:hAnsi="Calibri"/>
-                <w:color w:val="222222"/>
-                <w:sz w:val="20"/>
-                <w:szCs w:val="20"/>
-              </w:rPr>
-              <w:t xml:space="preserve">Con recargo (véase el apartado 3)</w:t>
-            </w:r>
-          </w:p>
-        </w:tc>
-      </w:tr>
-    </w:tbl>
-    <w:p>
-      <w:pPr>
-        <w:spacing w:after="60"/>
-      </w:pPr>
+        <w:t xml:space="preserve">El paciente rellena el formulario adjunto y nos lo envía por correo electrónico a info@medassure.es a más tardar un día antes de la operación.</w:t>
+      </w:r>
     </w:p>
     <w:p>
       <w:pPr>
         <w:keepNext/>
-        <w:spacing w:before="120" w:after="80" w:line="276"/>
+        <w:spacing w:before="60" w:after="80" w:line="276"/>
       </w:pPr>
       <w:r>
         <w:rPr>
@@ -997,7 +453,7 @@
           <w:sz w:val="22"/>
           <w:szCs w:val="22"/>
         </w:rPr>
-        <w:t xml:space="preserve">Opción 2: el paciente contrata directamente</w:t>
+        <w:t xml:space="preserve">En línea</w:t>
       </w:r>
     </w:p>
     <w:p>
@@ -1010,7 +466,7 @@
           <w:sz w:val="22"/>
           <w:szCs w:val="22"/>
         </w:rPr>
-        <w:t xml:space="preserve">El paciente rellena el formulario de solicitud adjunto y nos lo envía a info@medassure.es, o contrata en línea en medassure.es. El propio paciente paga la prima y gestiona el seguro directamente con nosotros, así que su clínica no tiene que cobrar ni facturar nada.</w:t>
+        <w:t xml:space="preserve">El paciente también puede contratar el seguro en nuestra web, medassure.es.</w:t>
       </w:r>
     </w:p>
     <w:p>
@@ -1023,7 +479,7 @@
           <w:sz w:val="22"/>
           <w:szCs w:val="22"/>
         </w:rPr>
-        <w:t xml:space="preserve">Pueden combinar las dos opciones y usar en cada caso la que mejor les encaje.</w:t>
+        <w:t xml:space="preserve">En los dos casos, el propio paciente paga la prima y gestiona el seguro con nosotros. Su clínica ya no tendrá que encargarse del cobro ni de la facturación. Muchas clínicas utilizan ya este formulario y la valoración es muy positiva.</w:t>
       </w:r>
     </w:p>
     <w:p>
@@ -1069,7 +525,7 @@
           <w:sz w:val="22"/>
           <w:szCs w:val="22"/>
         </w:rPr>
-        <w:t xml:space="preserve">Las dos tarifas cubren las mismas complicaciones. La tarifa Básica mantiene las sumas aseguradas actuales y la tarifa Premium las aumenta un 50 %:</w:t>
+        <w:t xml:space="preserve">Las dos tarifas cubren las mismas complicaciones. La tarifa Básica mantiene las sumas aseguradas actuales y la tarifa Premium las aumenta un 50 %.</w:t>
       </w:r>
     </w:p>
     <w:tbl>
@@ -1262,7 +718,7 @@
                 <w:sz w:val="20"/>
                 <w:szCs w:val="20"/>
               </w:rPr>
-              <w:t xml:space="preserve">10.000 €</w:t>
+              <w:t xml:space="preserve">10.000 €</w:t>
             </w:r>
           </w:p>
         </w:tc>
@@ -1295,7 +751,7 @@
                 <w:sz w:val="20"/>
                 <w:szCs w:val="20"/>
               </w:rPr>
-              <w:t xml:space="preserve">15.000 €</w:t>
+              <w:t xml:space="preserve">15.000 €</w:t>
             </w:r>
           </w:p>
         </w:tc>
@@ -1368,7 +824,7 @@
                 <w:sz w:val="20"/>
                 <w:szCs w:val="20"/>
               </w:rPr>
-              <w:t xml:space="preserve">5.000 €</w:t>
+              <w:t xml:space="preserve">5.000 €</w:t>
             </w:r>
           </w:p>
         </w:tc>
@@ -1402,7 +858,7 @@
                 <w:sz w:val="20"/>
                 <w:szCs w:val="20"/>
               </w:rPr>
-              <w:t xml:space="preserve">7.500 €</w:t>
+              <w:t xml:space="preserve">7.500 €</w:t>
             </w:r>
           </w:p>
         </w:tc>
@@ -1473,7 +929,7 @@
                 <w:sz w:val="20"/>
                 <w:szCs w:val="20"/>
               </w:rPr>
-              <w:t xml:space="preserve">hasta 100.000 €</w:t>
+              <w:t xml:space="preserve">hasta 100.000 €</w:t>
             </w:r>
           </w:p>
         </w:tc>
@@ -1506,7 +962,7 @@
                 <w:sz w:val="20"/>
                 <w:szCs w:val="20"/>
               </w:rPr>
-              <w:t xml:space="preserve">hasta 150.000 €</w:t>
+              <w:t xml:space="preserve">hasta 150.000 €</w:t>
             </w:r>
           </w:p>
         </w:tc>
@@ -1631,7 +1087,7 @@
           <w:sz w:val="22"/>
           <w:szCs w:val="22"/>
         </w:rPr>
-        <w:t xml:space="preserve">También hemos ajustado la tabla de indemnizaciones y añadido conceptos nuevos, como la UCI privada (hasta 1.500 € en Básica y 3.000 € en Premium). La tabla completa está en el documento adjunto.</w:t>
+        <w:t xml:space="preserve">Además, hemos ajustado la tabla de indemnizaciones y añadido nuevas coberturas, como la UCI privada (hasta 1.500 € en Básica y hasta 3.000 € en Premium). Encontrarán la tabla completa en el documento adjunto.</w:t>
       </w:r>
     </w:p>
     <w:p>
@@ -1677,7 +1133,7 @@
           <w:sz w:val="22"/>
           <w:szCs w:val="22"/>
         </w:rPr>
-        <w:t xml:space="preserve">La prima es única: se paga una sola vez por intervención y cubre todo el periodo elegido. Se calcula en tres pasos:</w:t>
+        <w:t xml:space="preserve">La prima es única. Se paga una sola vez por intervención y cubre todo el periodo elegido. Para saber cuánto cuesta, basta con seguir tres pasos.</w:t>
       </w:r>
     </w:p>
     <w:p>
@@ -1702,7 +1158,7 @@
           <w:sz w:val="22"/>
           <w:szCs w:val="22"/>
         </w:rPr>
-        <w:t xml:space="preserve">Cada tratamiento tiene una categoría, de la A a la E (la de cada tratamiento está en el documento adjunto). Si en la intervención se hacen varios tratamientos, cuenta el de categoría más alta.</w:t>
+        <w:t xml:space="preserve">Cada tratamiento tiene una categoría, de la A a la E, que encontrarán en el documento adjunto. Si en la intervención se hacen varios tratamientos, cuenta el de categoría más alta.</w:t>
       </w:r>
     </w:p>
     <w:p>
@@ -1727,7 +1183,7 @@
           <w:sz w:val="22"/>
           <w:szCs w:val="22"/>
         </w:rPr>
-        <w:t xml:space="preserve">Elijan Básica o Premium y una duración de 1, 2 o 5 años. El precio está en la casilla donde se cruzan la categoría y la duración de la tarifa elegida.</w:t>
+        <w:t xml:space="preserve">Se elige la tarifa Básica o Premium y una duración de 1, 2 o 5 años. El precio está en la casilla donde se cruzan la categoría y la duración dentro de la tarifa elegida.</w:t>
       </w:r>
     </w:p>
     <w:p>
@@ -1753,7 +1209,7 @@
           <w:sz w:val="22"/>
           <w:szCs w:val="22"/>
         </w:rPr>
-        <w:t xml:space="preserve">Si se aseguran varios tratamientos en la misma intervención, se suma un único recargo: +50 € con 2 tratamientos, +75 € con 3 y +100 € con 4 (solo Premium).</w:t>
+        <w:t xml:space="preserve">Si se aseguran varios tratamientos en la misma intervención, se suma un único recargo de 50 € con 2 tratamientos, 75 € con 3 y 100 € con 4 (solo en Premium).</w:t>
       </w:r>
     </w:p>
     <w:tbl>
@@ -2212,7 +1668,7 @@
                 <w:sz w:val="20"/>
                 <w:szCs w:val="20"/>
               </w:rPr>
-              <w:t xml:space="preserve">69 €</w:t>
+              <w:t xml:space="preserve">69 €</w:t>
             </w:r>
           </w:p>
         </w:tc>
@@ -2245,7 +1701,7 @@
                 <w:sz w:val="20"/>
                 <w:szCs w:val="20"/>
               </w:rPr>
-              <w:t xml:space="preserve">99 €</w:t>
+              <w:t xml:space="preserve">99 €</w:t>
             </w:r>
           </w:p>
         </w:tc>
@@ -2278,7 +1734,7 @@
                 <w:sz w:val="20"/>
                 <w:szCs w:val="20"/>
               </w:rPr>
-              <w:t xml:space="preserve">129 €</w:t>
+              <w:t xml:space="preserve">129 €</w:t>
             </w:r>
           </w:p>
         </w:tc>
@@ -2311,7 +1767,7 @@
                 <w:sz w:val="20"/>
                 <w:szCs w:val="20"/>
               </w:rPr>
-              <w:t xml:space="preserve">99 €</w:t>
+              <w:t xml:space="preserve">99 €</w:t>
             </w:r>
           </w:p>
         </w:tc>
@@ -2344,7 +1800,7 @@
                 <w:sz w:val="20"/>
                 <w:szCs w:val="20"/>
               </w:rPr>
-              <w:t xml:space="preserve">129 €</w:t>
+              <w:t xml:space="preserve">129 €</w:t>
             </w:r>
           </w:p>
         </w:tc>
@@ -2377,7 +1833,7 @@
                 <w:sz w:val="20"/>
                 <w:szCs w:val="20"/>
               </w:rPr>
-              <w:t xml:space="preserve">149 €</w:t>
+              <w:t xml:space="preserve">149 €</w:t>
             </w:r>
           </w:p>
         </w:tc>
@@ -2452,7 +1908,7 @@
                 <w:sz w:val="20"/>
                 <w:szCs w:val="20"/>
               </w:rPr>
-              <w:t xml:space="preserve">99 €</w:t>
+              <w:t xml:space="preserve">99 €</w:t>
             </w:r>
           </w:p>
         </w:tc>
@@ -2486,7 +1942,7 @@
                 <w:sz w:val="20"/>
                 <w:szCs w:val="20"/>
               </w:rPr>
-              <w:t xml:space="preserve">129 €</w:t>
+              <w:t xml:space="preserve">129 €</w:t>
             </w:r>
           </w:p>
         </w:tc>
@@ -2520,7 +1976,7 @@
                 <w:sz w:val="20"/>
                 <w:szCs w:val="20"/>
               </w:rPr>
-              <w:t xml:space="preserve">159 €</w:t>
+              <w:t xml:space="preserve">159 €</w:t>
             </w:r>
           </w:p>
         </w:tc>
@@ -2554,7 +2010,7 @@
                 <w:sz w:val="20"/>
                 <w:szCs w:val="20"/>
               </w:rPr>
-              <w:t xml:space="preserve">149 €</w:t>
+              <w:t xml:space="preserve">149 €</w:t>
             </w:r>
           </w:p>
         </w:tc>
@@ -2588,7 +2044,7 @@
                 <w:sz w:val="20"/>
                 <w:szCs w:val="20"/>
               </w:rPr>
-              <w:t xml:space="preserve">179 €</w:t>
+              <w:t xml:space="preserve">179 €</w:t>
             </w:r>
           </w:p>
         </w:tc>
@@ -2622,7 +2078,7 @@
                 <w:sz w:val="20"/>
                 <w:szCs w:val="20"/>
               </w:rPr>
-              <w:t xml:space="preserve">199 €</w:t>
+              <w:t xml:space="preserve">199 €</w:t>
             </w:r>
           </w:p>
         </w:tc>
@@ -2695,7 +2151,7 @@
                 <w:sz w:val="20"/>
                 <w:szCs w:val="20"/>
               </w:rPr>
-              <w:t xml:space="preserve">169 €</w:t>
+              <w:t xml:space="preserve">169 €</w:t>
             </w:r>
           </w:p>
         </w:tc>
@@ -2728,7 +2184,7 @@
                 <w:sz w:val="20"/>
                 <w:szCs w:val="20"/>
               </w:rPr>
-              <w:t xml:space="preserve">219 €</w:t>
+              <w:t xml:space="preserve">219 €</w:t>
             </w:r>
           </w:p>
         </w:tc>
@@ -2761,7 +2217,7 @@
                 <w:sz w:val="20"/>
                 <w:szCs w:val="20"/>
               </w:rPr>
-              <w:t xml:space="preserve">269 €</w:t>
+              <w:t xml:space="preserve">269 €</w:t>
             </w:r>
           </w:p>
         </w:tc>
@@ -2794,7 +2250,7 @@
                 <w:sz w:val="20"/>
                 <w:szCs w:val="20"/>
               </w:rPr>
-              <w:t xml:space="preserve">249 €</w:t>
+              <w:t xml:space="preserve">249 €</w:t>
             </w:r>
           </w:p>
         </w:tc>
@@ -2827,7 +2283,7 @@
                 <w:sz w:val="20"/>
                 <w:szCs w:val="20"/>
               </w:rPr>
-              <w:t xml:space="preserve">299 €</w:t>
+              <w:t xml:space="preserve">299 €</w:t>
             </w:r>
           </w:p>
         </w:tc>
@@ -2860,7 +2316,7 @@
                 <w:sz w:val="20"/>
                 <w:szCs w:val="20"/>
               </w:rPr>
-              <w:t xml:space="preserve">329 €</w:t>
+              <w:t xml:space="preserve">329 €</w:t>
             </w:r>
           </w:p>
         </w:tc>
@@ -2935,7 +2391,7 @@
                 <w:sz w:val="20"/>
                 <w:szCs w:val="20"/>
               </w:rPr>
-              <w:t xml:space="preserve">189 €</w:t>
+              <w:t xml:space="preserve">189 €</w:t>
             </w:r>
           </w:p>
         </w:tc>
@@ -2969,7 +2425,7 @@
                 <w:sz w:val="20"/>
                 <w:szCs w:val="20"/>
               </w:rPr>
-              <w:t xml:space="preserve">239 €</w:t>
+              <w:t xml:space="preserve">239 €</w:t>
             </w:r>
           </w:p>
         </w:tc>
@@ -3003,7 +2459,7 @@
                 <w:sz w:val="20"/>
                 <w:szCs w:val="20"/>
               </w:rPr>
-              <w:t xml:space="preserve">289 €</w:t>
+              <w:t xml:space="preserve">289 €</w:t>
             </w:r>
           </w:p>
         </w:tc>
@@ -3037,7 +2493,7 @@
                 <w:sz w:val="20"/>
                 <w:szCs w:val="20"/>
               </w:rPr>
-              <w:t xml:space="preserve">279 €</w:t>
+              <w:t xml:space="preserve">279 €</w:t>
             </w:r>
           </w:p>
         </w:tc>
@@ -3071,7 +2527,7 @@
                 <w:sz w:val="20"/>
                 <w:szCs w:val="20"/>
               </w:rPr>
-              <w:t xml:space="preserve">349 €</w:t>
+              <w:t xml:space="preserve">349 €</w:t>
             </w:r>
           </w:p>
         </w:tc>
@@ -3105,7 +2561,7 @@
                 <w:sz w:val="20"/>
                 <w:szCs w:val="20"/>
               </w:rPr>
-              <w:t xml:space="preserve">399 €</w:t>
+              <w:t xml:space="preserve">399 €</w:t>
             </w:r>
           </w:p>
         </w:tc>
@@ -3176,7 +2632,7 @@
                 <w:sz w:val="20"/>
                 <w:szCs w:val="20"/>
               </w:rPr>
-              <w:t xml:space="preserve">289 €</w:t>
+              <w:t xml:space="preserve">289 €</w:t>
             </w:r>
           </w:p>
         </w:tc>
@@ -3208,7 +2664,7 @@
                 <w:sz w:val="20"/>
                 <w:szCs w:val="20"/>
               </w:rPr>
-              <w:t xml:space="preserve">429 €</w:t>
+              <w:t xml:space="preserve">429 €</w:t>
             </w:r>
           </w:p>
         </w:tc>
@@ -3240,7 +2696,7 @@
                 <w:sz w:val="20"/>
                 <w:szCs w:val="20"/>
               </w:rPr>
-              <w:t xml:space="preserve">599 €</w:t>
+              <w:t xml:space="preserve">599 €</w:t>
             </w:r>
           </w:p>
         </w:tc>
@@ -3272,7 +2728,7 @@
                 <w:sz w:val="20"/>
                 <w:szCs w:val="20"/>
               </w:rPr>
-              <w:t xml:space="preserve">429 €</w:t>
+              <w:t xml:space="preserve">429 €</w:t>
             </w:r>
           </w:p>
         </w:tc>
@@ -3304,7 +2760,7 @@
                 <w:sz w:val="20"/>
                 <w:szCs w:val="20"/>
               </w:rPr>
-              <w:t xml:space="preserve">599 €</w:t>
+              <w:t xml:space="preserve">599 €</w:t>
             </w:r>
           </w:p>
         </w:tc>
@@ -3336,7 +2792,7 @@
                 <w:sz w:val="20"/>
                 <w:szCs w:val="20"/>
               </w:rPr>
-              <w:t xml:space="preserve">799 €</w:t>
+              <w:t xml:space="preserve">799 €</w:t>
             </w:r>
           </w:p>
         </w:tc>
@@ -3388,7 +2844,7 @@
                 <w:sz w:val="22"/>
                 <w:szCs w:val="22"/>
               </w:rPr>
-              <w:t xml:space="preserve">Ejemplos</w:t>
+              <w:t xml:space="preserve">Dos ejemplos</w:t>
             </w:r>
           </w:p>
           <w:p>
@@ -3401,7 +2857,7 @@
                 <w:sz w:val="22"/>
                 <w:szCs w:val="22"/>
               </w:rPr>
-              <w:t xml:space="preserve">Rinoplastia (C), tarifa Premium, 2 años: </w:t>
+              <w:t xml:space="preserve">Una rinoplastia (C) con tarifa Premium durante 2 años cuesta </w:t>
             </w:r>
             <w:r>
               <w:rPr>
@@ -3412,7 +2868,7 @@
                 <w:sz w:val="22"/>
                 <w:szCs w:val="22"/>
               </w:rPr>
-              <w:t xml:space="preserve">299 €.</w:t>
+              <w:t xml:space="preserve">299 €.</w:t>
             </w:r>
           </w:p>
           <w:p>
@@ -3425,7 +2881,7 @@
                 <w:sz w:val="22"/>
                 <w:szCs w:val="22"/>
               </w:rPr>
-              <w:t xml:space="preserve">Rinoplastia (C) y aumento de mamas con implantes (E), tarifa Básica, 1 año: cuenta la categoría más alta, E, que son 289 €, y se suman 50 € por ser dos tratamientos. </w:t>
+              <w:t xml:space="preserve">Una rinoplastia (C) y un aumento de mamas con implantes (E) con tarifa Básica durante 1 año cuestan </w:t>
             </w:r>
             <w:r>
               <w:rPr>
@@ -3436,7 +2892,15 @@
                 <w:sz w:val="22"/>
                 <w:szCs w:val="22"/>
               </w:rPr>
-              <w:t xml:space="preserve">Prima total: 339 €.</w:t>
+              <w:t xml:space="preserve">339 €.</w:t>
+            </w:r>
+            <w:r>
+              <w:rPr>
+                <w:rFonts w:ascii="Calibri" w:cs="Calibri" w:eastAsia="Calibri" w:hAnsi="Calibri"/>
+                <w:sz w:val="22"/>
+                <w:szCs w:val="22"/>
+              </w:rPr>
+              <w:t xml:space="preserve"> Cuenta la categoría más alta, la E, con 289 €, y se suman 50 € por ser dos tratamientos.</w:t>
             </w:r>
           </w:p>
         </w:tc>
@@ -3499,45 +2963,10 @@
       <w:r>
         <w:rPr>
           <w:rFonts w:ascii="Calibri" w:cs="Calibri" w:eastAsia="Calibri" w:hAnsi="Calibri"/>
-          <w:b/>
-          <w:bCs/>
-          <w:color w:val="1F3B5C"/>
           <w:sz w:val="22"/>
           <w:szCs w:val="22"/>
         </w:rPr>
-        <w:t xml:space="preserve">Si siguen enviando las altas por Excel, </w:t>
-      </w:r>
-      <w:r>
-        <w:rPr>
-          <w:rFonts w:ascii="Calibri" w:cs="Calibri" w:eastAsia="Calibri" w:hAnsi="Calibri"/>
-          <w:sz w:val="22"/>
-          <w:szCs w:val="22"/>
-        </w:rPr>
-        <w:t xml:space="preserve">a partir del 1 de enero de 2027 usen el nuevo Excel adjunto, indiquen el IBAN de la clínica y envíennos los datos como mínimo un día antes de la operación. No podremos dar de alta a pacientes una vez pasada la fecha de la intervención.</w:t>
-      </w:r>
-    </w:p>
-    <w:p>
-      <w:pPr>
-        <w:spacing w:after="140" w:line="276"/>
-      </w:pPr>
-      <w:r>
-        <w:rPr>
-          <w:rFonts w:ascii="Calibri" w:cs="Calibri" w:eastAsia="Calibri" w:hAnsi="Calibri"/>
-          <w:b/>
-          <w:bCs/>
-          <w:color w:val="1F3B5C"/>
-          <w:sz w:val="22"/>
-          <w:szCs w:val="22"/>
-        </w:rPr>
-        <w:t xml:space="preserve">Si prefieren que contrate el paciente, </w:t>
-      </w:r>
-      <w:r>
-        <w:rPr>
-          <w:rFonts w:ascii="Calibri" w:cs="Calibri" w:eastAsia="Calibri" w:hAnsi="Calibri"/>
-          <w:sz w:val="22"/>
-          <w:szCs w:val="22"/>
-        </w:rPr>
-        <w:t xml:space="preserve">entréguenle el formulario de solicitud adjunto para que nos lo envíe a info@medassure.es, o indíquenle que contrate en línea en medassure.es.</w:t>
+        <w:t xml:space="preserve">A partir del 1 de enero de 2027, basta con que entreguen a sus pacientes el formulario de solicitud adjunto o les indiquen que pueden contratar en medassure.es. Recuerden que el seguro debe contratarse antes de la operación.</w:t>
       </w:r>
     </w:p>
     <w:tbl>
@@ -3594,7 +3023,7 @@
                 <w:sz w:val="22"/>
                 <w:szCs w:val="22"/>
               </w:rPr>
-              <w:t xml:space="preserve">En ese caso, su clínica puede mantener el contrato de grupo con las nuevas primas y sin recargo por varios tratamientos. Podrán dar de alta a sus pacientes en nuestro portal online o con el Excel, y seguiremos facturando mensualmente. Escríbannos antes del 1 de enero de 2027 y les enviaremos sus datos de acceso.</w:t>
+              <w:t xml:space="preserve">En ese caso, su clínica puede mantener el contrato de grupo con las nuevas primas y sin recargo por varios tratamientos. Podrán dar de alta a sus pacientes en nuestro portal online y seguiremos facturando mensualmente. Escríbannos antes del 1 de enero de 2027 y les enviaremos sus datos de acceso.</w:t>
             </w:r>
           </w:p>
         </w:tc>

</xml_diff>

<commit_message>
Carta medassure beauty: categoría de cada tratamiento dentro de la carta
- Tabla con los tratamientos de cada categoría (A-F), según la calculadora de
  medassurance.de, en lugar de remitir a un documento adjunto.
- Categoría F (liposucción de 3 intervenciones con lifting por láser o
  radiofrecuencia) añadida a la tabla de primas.
- Se quita el apartado «Qué tienen que hacer», que repetía el apartado 1, para
  que la carta siga en 3 páginas.

Co-Authored-By: Claude Opus 5.5 <noreply@anthropic.com>
Claude-Session: https://claude.ai/code/session_01BbVdXybygTjqWXzNsPXUcQ
</commit_message>
<xml_diff>
--- a/medassure_beauty_Carta_clientes_ES.docx
+++ b/medassure_beauty_Carta_clientes_ES.docx
@@ -1158,7 +1158,7 @@
           <w:sz w:val="22"/>
           <w:szCs w:val="22"/>
         </w:rPr>
-        <w:t xml:space="preserve">Cada tratamiento tiene una categoría, de la A a la E, que encontrarán en el documento adjunto. Si en la intervención se hacen varios tratamientos, cuenta el de categoría más alta.</w:t>
+        <w:t xml:space="preserve">Cada tratamiento tiene una categoría, que aparece en la primera tabla de abajo. Si en la intervención se hacen varios tratamientos, cuenta el de categoría más cara.</w:t>
       </w:r>
     </w:p>
     <w:p>
@@ -1212,6 +1212,575 @@
         <w:t xml:space="preserve">Si se aseguran varios tratamientos en la misma intervención, se suma un único recargo de 50 € con 2 tratamientos, 75 € con 3 y 100 € con 4 (solo en Premium).</w:t>
       </w:r>
     </w:p>
+    <w:p>
+      <w:pPr>
+        <w:keepNext/>
+        <w:spacing w:before="60" w:after="80" w:line="276"/>
+      </w:pPr>
+      <w:r>
+        <w:rPr>
+          <w:rFonts w:ascii="Calibri" w:cs="Calibri" w:eastAsia="Calibri" w:hAnsi="Calibri"/>
+          <w:b/>
+          <w:bCs/>
+          <w:color w:val="1F3B5C"/>
+          <w:sz w:val="22"/>
+          <w:szCs w:val="22"/>
+        </w:rPr>
+        <w:t xml:space="preserve">Categoría de cada tratamiento</w:t>
+      </w:r>
+    </w:p>
+    <w:tbl>
+      <w:tblPr>
+        <w:tblW w:type="dxa" w:w="9906"/>
+        <w:tblLayout w:type="fixed"/>
+      </w:tblPr>
+      <w:tblGrid>
+        <w:gridCol w:w="1300"/>
+        <w:gridCol w:w="8606"/>
+      </w:tblGrid>
+      <w:tr>
+        <w:trPr>
+          <w:cantSplit/>
+          <w:tblHeader/>
+        </w:trPr>
+        <w:tc>
+          <w:tcPr>
+            <w:tcW w:type="dxa" w:w="1300"/>
+            <w:tcBorders>
+              <w:top w:val="single" w:color="D6E6F3" w:sz="4"/>
+              <w:left w:val="none" w:color="FFFFFF" w:sz="0"/>
+              <w:bottom w:val="single" w:color="D6E6F3" w:sz="4"/>
+              <w:right w:val="none" w:color="FFFFFF" w:sz="0"/>
+            </w:tcBorders>
+            <w:shd w:fill="1F3B5C" w:color="auto" w:val="clear"/>
+            <w:tcMar>
+              <w:top w:type="dxa" w:w="70"/>
+              <w:left w:type="dxa" w:w="120"/>
+              <w:bottom w:type="dxa" w:w="70"/>
+              <w:right w:type="dxa" w:w="120"/>
+            </w:tcMar>
+            <w:vAlign w:val="center"/>
+          </w:tcPr>
+          <w:p>
+            <w:pPr>
+              <w:keepNext/>
+              <w:jc w:val="center"/>
+            </w:pPr>
+            <w:r>
+              <w:rPr>
+                <w:rFonts w:ascii="Calibri" w:cs="Calibri" w:eastAsia="Calibri" w:hAnsi="Calibri"/>
+                <w:b/>
+                <w:bCs/>
+                <w:color w:val="FFFFFF"/>
+                <w:sz w:val="20"/>
+                <w:szCs w:val="20"/>
+              </w:rPr>
+              <w:t xml:space="preserve">Categoría</w:t>
+            </w:r>
+          </w:p>
+        </w:tc>
+        <w:tc>
+          <w:tcPr>
+            <w:tcW w:type="dxa" w:w="8606"/>
+            <w:tcBorders>
+              <w:top w:val="single" w:color="D6E6F3" w:sz="4"/>
+              <w:left w:val="none" w:color="FFFFFF" w:sz="0"/>
+              <w:bottom w:val="single" w:color="D6E6F3" w:sz="4"/>
+              <w:right w:val="none" w:color="FFFFFF" w:sz="0"/>
+            </w:tcBorders>
+            <w:shd w:fill="1F3B5C" w:color="auto" w:val="clear"/>
+            <w:tcMar>
+              <w:top w:type="dxa" w:w="70"/>
+              <w:left w:type="dxa" w:w="120"/>
+              <w:bottom w:type="dxa" w:w="70"/>
+              <w:right w:type="dxa" w:w="120"/>
+            </w:tcMar>
+            <w:vAlign w:val="center"/>
+          </w:tcPr>
+          <w:p>
+            <w:pPr>
+              <w:keepNext/>
+              <w:jc w:val="left"/>
+            </w:pPr>
+            <w:r>
+              <w:rPr>
+                <w:rFonts w:ascii="Calibri" w:cs="Calibri" w:eastAsia="Calibri" w:hAnsi="Calibri"/>
+                <w:b/>
+                <w:bCs/>
+                <w:color w:val="FFFFFF"/>
+                <w:sz w:val="20"/>
+                <w:szCs w:val="20"/>
+              </w:rPr>
+              <w:t xml:space="preserve">Tratamientos</w:t>
+            </w:r>
+          </w:p>
+        </w:tc>
+      </w:tr>
+      <w:tr>
+        <w:trPr>
+          <w:cantSplit/>
+        </w:trPr>
+        <w:tc>
+          <w:tcPr>
+            <w:tcW w:type="dxa" w:w="1300"/>
+            <w:tcBorders>
+              <w:top w:val="single" w:color="D6E6F3" w:sz="4"/>
+              <w:left w:val="none" w:color="FFFFFF" w:sz="0"/>
+              <w:bottom w:val="single" w:color="D6E6F3" w:sz="4"/>
+              <w:right w:val="none" w:color="FFFFFF" w:sz="0"/>
+            </w:tcBorders>
+            <w:tcMar>
+              <w:top w:type="dxa" w:w="70"/>
+              <w:left w:type="dxa" w:w="120"/>
+              <w:bottom w:type="dxa" w:w="70"/>
+              <w:right w:type="dxa" w:w="120"/>
+            </w:tcMar>
+            <w:vAlign w:val="center"/>
+          </w:tcPr>
+          <w:p>
+            <w:pPr>
+              <w:keepNext/>
+              <w:jc w:val="center"/>
+            </w:pPr>
+            <w:r>
+              <w:rPr>
+                <w:rFonts w:ascii="Calibri" w:cs="Calibri" w:eastAsia="Calibri" w:hAnsi="Calibri"/>
+                <w:b/>
+                <w:bCs/>
+                <w:color w:val="1F3B5C"/>
+                <w:sz w:val="20"/>
+                <w:szCs w:val="20"/>
+              </w:rPr>
+              <w:t xml:space="preserve">A</w:t>
+            </w:r>
+          </w:p>
+        </w:tc>
+        <w:tc>
+          <w:tcPr>
+            <w:tcW w:type="dxa" w:w="8606"/>
+            <w:tcBorders>
+              <w:top w:val="single" w:color="D6E6F3" w:sz="4"/>
+              <w:left w:val="none" w:color="FFFFFF" w:sz="0"/>
+              <w:bottom w:val="single" w:color="D6E6F3" w:sz="4"/>
+              <w:right w:val="none" w:color="FFFFFF" w:sz="0"/>
+            </w:tcBorders>
+            <w:tcMar>
+              <w:top w:type="dxa" w:w="70"/>
+              <w:left w:type="dxa" w:w="120"/>
+              <w:bottom w:type="dxa" w:w="70"/>
+              <w:right w:type="dxa" w:w="120"/>
+            </w:tcMar>
+            <w:vAlign w:val="center"/>
+          </w:tcPr>
+          <w:p>
+            <w:pPr>
+              <w:keepNext/>
+              <w:jc w:val="left"/>
+            </w:pPr>
+            <w:r>
+              <w:rPr>
+                <w:rFonts w:ascii="Calibri" w:cs="Calibri" w:eastAsia="Calibri" w:hAnsi="Calibri"/>
+                <w:color w:val="222222"/>
+                <w:sz w:val="20"/>
+                <w:szCs w:val="20"/>
+              </w:rPr>
+              <w:t xml:space="preserve">Blefaroplastia (párpados), corrección de orejas prominentes, trasplante capilar, liposucción (1 intervención)</w:t>
+            </w:r>
+          </w:p>
+        </w:tc>
+      </w:tr>
+      <w:tr>
+        <w:trPr>
+          <w:cantSplit/>
+        </w:trPr>
+        <w:tc>
+          <w:tcPr>
+            <w:tcW w:type="dxa" w:w="1300"/>
+            <w:tcBorders>
+              <w:top w:val="single" w:color="D6E6F3" w:sz="4"/>
+              <w:left w:val="none" w:color="FFFFFF" w:sz="0"/>
+              <w:bottom w:val="single" w:color="D6E6F3" w:sz="4"/>
+              <w:right w:val="none" w:color="FFFFFF" w:sz="0"/>
+            </w:tcBorders>
+            <w:shd w:fill="EAF4FC" w:color="auto" w:val="clear"/>
+            <w:tcMar>
+              <w:top w:type="dxa" w:w="70"/>
+              <w:left w:type="dxa" w:w="120"/>
+              <w:bottom w:type="dxa" w:w="70"/>
+              <w:right w:type="dxa" w:w="120"/>
+            </w:tcMar>
+            <w:vAlign w:val="center"/>
+          </w:tcPr>
+          <w:p>
+            <w:pPr>
+              <w:keepNext/>
+              <w:jc w:val="center"/>
+            </w:pPr>
+            <w:r>
+              <w:rPr>
+                <w:rFonts w:ascii="Calibri" w:cs="Calibri" w:eastAsia="Calibri" w:hAnsi="Calibri"/>
+                <w:b/>
+                <w:bCs/>
+                <w:color w:val="1F3B5C"/>
+                <w:sz w:val="20"/>
+                <w:szCs w:val="20"/>
+              </w:rPr>
+              <w:t xml:space="preserve">B</w:t>
+            </w:r>
+          </w:p>
+        </w:tc>
+        <w:tc>
+          <w:tcPr>
+            <w:tcW w:type="dxa" w:w="8606"/>
+            <w:tcBorders>
+              <w:top w:val="single" w:color="D6E6F3" w:sz="4"/>
+              <w:left w:val="none" w:color="FFFFFF" w:sz="0"/>
+              <w:bottom w:val="single" w:color="D6E6F3" w:sz="4"/>
+              <w:right w:val="none" w:color="FFFFFF" w:sz="0"/>
+            </w:tcBorders>
+            <w:shd w:fill="EAF4FC" w:color="auto" w:val="clear"/>
+            <w:tcMar>
+              <w:top w:type="dxa" w:w="70"/>
+              <w:left w:type="dxa" w:w="120"/>
+              <w:bottom w:type="dxa" w:w="70"/>
+              <w:right w:type="dxa" w:w="120"/>
+            </w:tcMar>
+            <w:vAlign w:val="center"/>
+          </w:tcPr>
+          <w:p>
+            <w:pPr>
+              <w:keepNext/>
+              <w:jc w:val="left"/>
+            </w:pPr>
+            <w:r>
+              <w:rPr>
+                <w:rFonts w:ascii="Calibri" w:cs="Calibri" w:eastAsia="Calibri" w:hAnsi="Calibri"/>
+                <w:color w:val="222222"/>
+                <w:sz w:val="20"/>
+                <w:szCs w:val="20"/>
+              </w:rPr>
+              <w:t xml:space="preserve">Lifting facial (frente, cejas, mejillas, labios, mentón), lifting de cuello, lifting facial con grasa autóloga, corrección de cicatrices, reducción de labios vaginales, aspiración de glándulas sudoríparas, liposucción (hasta 3 intervenciones), liposucción con lifting por láser o radiofrecuencia (1 intervención)</w:t>
+            </w:r>
+          </w:p>
+        </w:tc>
+      </w:tr>
+      <w:tr>
+        <w:trPr>
+          <w:cantSplit/>
+        </w:trPr>
+        <w:tc>
+          <w:tcPr>
+            <w:tcW w:type="dxa" w:w="1300"/>
+            <w:tcBorders>
+              <w:top w:val="single" w:color="D6E6F3" w:sz="4"/>
+              <w:left w:val="none" w:color="FFFFFF" w:sz="0"/>
+              <w:bottom w:val="single" w:color="D6E6F3" w:sz="4"/>
+              <w:right w:val="none" w:color="FFFFFF" w:sz="0"/>
+            </w:tcBorders>
+            <w:tcMar>
+              <w:top w:type="dxa" w:w="70"/>
+              <w:left w:type="dxa" w:w="120"/>
+              <w:bottom w:type="dxa" w:w="70"/>
+              <w:right w:type="dxa" w:w="120"/>
+            </w:tcMar>
+            <w:vAlign w:val="center"/>
+          </w:tcPr>
+          <w:p>
+            <w:pPr>
+              <w:keepNext/>
+              <w:jc w:val="center"/>
+            </w:pPr>
+            <w:r>
+              <w:rPr>
+                <w:rFonts w:ascii="Calibri" w:cs="Calibri" w:eastAsia="Calibri" w:hAnsi="Calibri"/>
+                <w:b/>
+                <w:bCs/>
+                <w:color w:val="1F3B5C"/>
+                <w:sz w:val="20"/>
+                <w:szCs w:val="20"/>
+              </w:rPr>
+              <w:t xml:space="preserve">C</w:t>
+            </w:r>
+          </w:p>
+        </w:tc>
+        <w:tc>
+          <w:tcPr>
+            <w:tcW w:type="dxa" w:w="8606"/>
+            <w:tcBorders>
+              <w:top w:val="single" w:color="D6E6F3" w:sz="4"/>
+              <w:left w:val="none" w:color="FFFFFF" w:sz="0"/>
+              <w:bottom w:val="single" w:color="D6E6F3" w:sz="4"/>
+              <w:right w:val="none" w:color="FFFFFF" w:sz="0"/>
+            </w:tcBorders>
+            <w:tcMar>
+              <w:top w:type="dxa" w:w="70"/>
+              <w:left w:type="dxa" w:w="120"/>
+              <w:bottom w:type="dxa" w:w="70"/>
+              <w:right w:type="dxa" w:w="120"/>
+            </w:tcMar>
+            <w:vAlign w:val="center"/>
+          </w:tcPr>
+          <w:p>
+            <w:pPr>
+              <w:keepNext/>
+              <w:jc w:val="left"/>
+            </w:pPr>
+            <w:r>
+              <w:rPr>
+                <w:rFonts w:ascii="Calibri" w:cs="Calibri" w:eastAsia="Calibri" w:hAnsi="Calibri"/>
+                <w:color w:val="222222"/>
+                <w:sz w:val="20"/>
+                <w:szCs w:val="20"/>
+              </w:rPr>
+              <w:t xml:space="preserve">Rinoplastia, abdominoplastia, lifting de brazos, lifting de muslos, lifting de glúteos, aumento de glúteos con grasa autóloga, reducción de pantorrillas, cirugía íntima o estética genital, balón gástrico</w:t>
+            </w:r>
+          </w:p>
+        </w:tc>
+      </w:tr>
+      <w:tr>
+        <w:trPr>
+          <w:cantSplit/>
+        </w:trPr>
+        <w:tc>
+          <w:tcPr>
+            <w:tcW w:type="dxa" w:w="1300"/>
+            <w:tcBorders>
+              <w:top w:val="single" w:color="D6E6F3" w:sz="4"/>
+              <w:left w:val="none" w:color="FFFFFF" w:sz="0"/>
+              <w:bottom w:val="single" w:color="D6E6F3" w:sz="4"/>
+              <w:right w:val="none" w:color="FFFFFF" w:sz="0"/>
+            </w:tcBorders>
+            <w:shd w:fill="EAF4FC" w:color="auto" w:val="clear"/>
+            <w:tcMar>
+              <w:top w:type="dxa" w:w="70"/>
+              <w:left w:type="dxa" w:w="120"/>
+              <w:bottom w:type="dxa" w:w="70"/>
+              <w:right w:type="dxa" w:w="120"/>
+            </w:tcMar>
+            <w:vAlign w:val="center"/>
+          </w:tcPr>
+          <w:p>
+            <w:pPr>
+              <w:keepNext/>
+              <w:jc w:val="center"/>
+            </w:pPr>
+            <w:r>
+              <w:rPr>
+                <w:rFonts w:ascii="Calibri" w:cs="Calibri" w:eastAsia="Calibri" w:hAnsi="Calibri"/>
+                <w:b/>
+                <w:bCs/>
+                <w:color w:val="1F3B5C"/>
+                <w:sz w:val="20"/>
+                <w:szCs w:val="20"/>
+              </w:rPr>
+              <w:t xml:space="preserve">D</w:t>
+            </w:r>
+          </w:p>
+        </w:tc>
+        <w:tc>
+          <w:tcPr>
+            <w:tcW w:type="dxa" w:w="8606"/>
+            <w:tcBorders>
+              <w:top w:val="single" w:color="D6E6F3" w:sz="4"/>
+              <w:left w:val="none" w:color="FFFFFF" w:sz="0"/>
+              <w:bottom w:val="single" w:color="D6E6F3" w:sz="4"/>
+              <w:right w:val="none" w:color="FFFFFF" w:sz="0"/>
+            </w:tcBorders>
+            <w:shd w:fill="EAF4FC" w:color="auto" w:val="clear"/>
+            <w:tcMar>
+              <w:top w:type="dxa" w:w="70"/>
+              <w:left w:type="dxa" w:w="120"/>
+              <w:bottom w:type="dxa" w:w="70"/>
+              <w:right w:type="dxa" w:w="120"/>
+            </w:tcMar>
+            <w:vAlign w:val="center"/>
+          </w:tcPr>
+          <w:p>
+            <w:pPr>
+              <w:keepNext/>
+              <w:jc w:val="left"/>
+            </w:pPr>
+            <w:r>
+              <w:rPr>
+                <w:rFonts w:ascii="Calibri" w:cs="Calibri" w:eastAsia="Calibri" w:hAnsi="Calibri"/>
+                <w:color w:val="222222"/>
+                <w:sz w:val="20"/>
+                <w:szCs w:val="20"/>
+              </w:rPr>
+              <w:t xml:space="preserve">Reducción o elevación de mamas, mastectomía, ginecomastia, extracción de implantes mamarios, cirugía de mamas con grasa autóloga, corrección de pezones, bodylift 360° (abdomen, cintura y espalda)</w:t>
+            </w:r>
+          </w:p>
+        </w:tc>
+      </w:tr>
+      <w:tr>
+        <w:trPr>
+          <w:cantSplit/>
+        </w:trPr>
+        <w:tc>
+          <w:tcPr>
+            <w:tcW w:type="dxa" w:w="1300"/>
+            <w:tcBorders>
+              <w:top w:val="single" w:color="D6E6F3" w:sz="4"/>
+              <w:left w:val="none" w:color="FFFFFF" w:sz="0"/>
+              <w:bottom w:val="single" w:color="D6E6F3" w:sz="4"/>
+              <w:right w:val="none" w:color="FFFFFF" w:sz="0"/>
+            </w:tcBorders>
+            <w:tcMar>
+              <w:top w:type="dxa" w:w="70"/>
+              <w:left w:type="dxa" w:w="120"/>
+              <w:bottom w:type="dxa" w:w="70"/>
+              <w:right w:type="dxa" w:w="120"/>
+            </w:tcMar>
+            <w:vAlign w:val="center"/>
+          </w:tcPr>
+          <w:p>
+            <w:pPr>
+              <w:keepNext/>
+              <w:jc w:val="center"/>
+            </w:pPr>
+            <w:r>
+              <w:rPr>
+                <w:rFonts w:ascii="Calibri" w:cs="Calibri" w:eastAsia="Calibri" w:hAnsi="Calibri"/>
+                <w:b/>
+                <w:bCs/>
+                <w:color w:val="1F3B5C"/>
+                <w:sz w:val="20"/>
+                <w:szCs w:val="20"/>
+              </w:rPr>
+              <w:t xml:space="preserve">E</w:t>
+            </w:r>
+          </w:p>
+        </w:tc>
+        <w:tc>
+          <w:tcPr>
+            <w:tcW w:type="dxa" w:w="8606"/>
+            <w:tcBorders>
+              <w:top w:val="single" w:color="D6E6F3" w:sz="4"/>
+              <w:left w:val="none" w:color="FFFFFF" w:sz="0"/>
+              <w:bottom w:val="single" w:color="D6E6F3" w:sz="4"/>
+              <w:right w:val="none" w:color="FFFFFF" w:sz="0"/>
+            </w:tcBorders>
+            <w:tcMar>
+              <w:top w:type="dxa" w:w="70"/>
+              <w:left w:type="dxa" w:w="120"/>
+              <w:bottom w:type="dxa" w:w="70"/>
+              <w:right w:type="dxa" w:w="120"/>
+            </w:tcMar>
+            <w:vAlign w:val="center"/>
+          </w:tcPr>
+          <w:p>
+            <w:pPr>
+              <w:keepNext/>
+              <w:jc w:val="left"/>
+            </w:pPr>
+            <w:r>
+              <w:rPr>
+                <w:rFonts w:ascii="Calibri" w:cs="Calibri" w:eastAsia="Calibri" w:hAnsi="Calibri"/>
+                <w:color w:val="222222"/>
+                <w:sz w:val="20"/>
+                <w:szCs w:val="20"/>
+              </w:rPr>
+              <w:t xml:space="preserve">Aumento de mamas con implantes, sustitución de implantes mamarios, aumento de glúteos con implantes, aumento de mentón con implante, aumento de pantorrillas con implantes, reducción gástrica (Overstitch, POSE, Endomina)</w:t>
+            </w:r>
+          </w:p>
+        </w:tc>
+      </w:tr>
+      <w:tr>
+        <w:trPr>
+          <w:cantSplit/>
+        </w:trPr>
+        <w:tc>
+          <w:tcPr>
+            <w:tcW w:type="dxa" w:w="1300"/>
+            <w:tcBorders>
+              <w:top w:val="single" w:color="D6E6F3" w:sz="4"/>
+              <w:left w:val="none" w:color="FFFFFF" w:sz="0"/>
+              <w:bottom w:val="single" w:color="D6E6F3" w:sz="4"/>
+              <w:right w:val="none" w:color="FFFFFF" w:sz="0"/>
+            </w:tcBorders>
+            <w:shd w:fill="EAF4FC" w:color="auto" w:val="clear"/>
+            <w:tcMar>
+              <w:top w:type="dxa" w:w="70"/>
+              <w:left w:type="dxa" w:w="120"/>
+              <w:bottom w:type="dxa" w:w="70"/>
+              <w:right w:type="dxa" w:w="120"/>
+            </w:tcMar>
+            <w:vAlign w:val="center"/>
+          </w:tcPr>
+          <w:p>
+            <w:pPr>
+              <w:jc w:val="center"/>
+            </w:pPr>
+            <w:r>
+              <w:rPr>
+                <w:rFonts w:ascii="Calibri" w:cs="Calibri" w:eastAsia="Calibri" w:hAnsi="Calibri"/>
+                <w:b/>
+                <w:bCs/>
+                <w:color w:val="1F3B5C"/>
+                <w:sz w:val="20"/>
+                <w:szCs w:val="20"/>
+              </w:rPr>
+              <w:t xml:space="preserve">F</w:t>
+            </w:r>
+          </w:p>
+        </w:tc>
+        <w:tc>
+          <w:tcPr>
+            <w:tcW w:type="dxa" w:w="8606"/>
+            <w:tcBorders>
+              <w:top w:val="single" w:color="D6E6F3" w:sz="4"/>
+              <w:left w:val="none" w:color="FFFFFF" w:sz="0"/>
+              <w:bottom w:val="single" w:color="D6E6F3" w:sz="4"/>
+              <w:right w:val="none" w:color="FFFFFF" w:sz="0"/>
+            </w:tcBorders>
+            <w:shd w:fill="EAF4FC" w:color="auto" w:val="clear"/>
+            <w:tcMar>
+              <w:top w:type="dxa" w:w="70"/>
+              <w:left w:type="dxa" w:w="120"/>
+              <w:bottom w:type="dxa" w:w="70"/>
+              <w:right w:type="dxa" w:w="120"/>
+            </w:tcMar>
+            <w:vAlign w:val="center"/>
+          </w:tcPr>
+          <w:p>
+            <w:pPr>
+              <w:jc w:val="left"/>
+            </w:pPr>
+            <w:r>
+              <w:rPr>
+                <w:rFonts w:ascii="Calibri" w:cs="Calibri" w:eastAsia="Calibri" w:hAnsi="Calibri"/>
+                <w:color w:val="222222"/>
+                <w:sz w:val="20"/>
+                <w:szCs w:val="20"/>
+              </w:rPr>
+              <w:t xml:space="preserve">Liposucción con lifting por láser o radiofrecuencia (3 intervenciones)</w:t>
+            </w:r>
+          </w:p>
+        </w:tc>
+      </w:tr>
+    </w:tbl>
+    <w:p>
+      <w:pPr>
+        <w:spacing w:after="100"/>
+      </w:pPr>
+    </w:p>
+    <w:p>
+      <w:pPr>
+        <w:keepNext/>
+        <w:spacing w:before="60" w:after="80" w:line="276"/>
+      </w:pPr>
+      <w:r>
+        <w:rPr>
+          <w:rFonts w:ascii="Calibri" w:cs="Calibri" w:eastAsia="Calibri" w:hAnsi="Calibri"/>
+          <w:b/>
+          <w:bCs/>
+          <w:color w:val="1F3B5C"/>
+          <w:sz w:val="22"/>
+          <w:szCs w:val="22"/>
+        </w:rPr>
+        <w:t xml:space="preserve">Primas por categoría</w:t>
+      </w:r>
+    </w:p>
     <w:tbl>
       <w:tblPr>
         <w:tblW w:type="dxa" w:w="9906"/>
@@ -2589,6 +3158,7 @@
           </w:tcPr>
           <w:p>
             <w:pPr>
+              <w:keepNext/>
               <w:jc w:val="left"/>
             </w:pPr>
             <w:r>
@@ -2623,6 +3193,7 @@
           </w:tcPr>
           <w:p>
             <w:pPr>
+              <w:keepNext/>
               <w:jc w:val="center"/>
             </w:pPr>
             <w:r>
@@ -2655,6 +3226,7 @@
           </w:tcPr>
           <w:p>
             <w:pPr>
+              <w:keepNext/>
               <w:jc w:val="center"/>
             </w:pPr>
             <w:r>
@@ -2687,6 +3259,7 @@
           </w:tcPr>
           <w:p>
             <w:pPr>
+              <w:keepNext/>
               <w:jc w:val="center"/>
             </w:pPr>
             <w:r>
@@ -2719,6 +3292,7 @@
           </w:tcPr>
           <w:p>
             <w:pPr>
+              <w:keepNext/>
               <w:jc w:val="center"/>
             </w:pPr>
             <w:r>
@@ -2751,6 +3325,7 @@
           </w:tcPr>
           <w:p>
             <w:pPr>
+              <w:keepNext/>
               <w:jc w:val="center"/>
             </w:pPr>
             <w:r>
@@ -2783,6 +3358,7 @@
           </w:tcPr>
           <w:p>
             <w:pPr>
+              <w:keepNext/>
               <w:jc w:val="center"/>
             </w:pPr>
             <w:r>
@@ -2793,6 +3369,244 @@
                 <w:szCs w:val="20"/>
               </w:rPr>
               <w:t xml:space="preserve">799 €</w:t>
+            </w:r>
+          </w:p>
+        </w:tc>
+      </w:tr>
+      <w:tr>
+        <w:trPr>
+          <w:cantSplit/>
+        </w:trPr>
+        <w:tc>
+          <w:tcPr>
+            <w:tcW w:type="dxa" w:w="1906"/>
+            <w:tcBorders>
+              <w:top w:val="single" w:color="D6E6F3" w:sz="4"/>
+              <w:left w:val="none" w:color="FFFFFF" w:sz="0"/>
+              <w:bottom w:val="single" w:color="D6E6F3" w:sz="4"/>
+              <w:right w:val="none" w:color="FFFFFF" w:sz="0"/>
+            </w:tcBorders>
+            <w:shd w:fill="EAF4FC" w:color="auto" w:val="clear"/>
+            <w:tcMar>
+              <w:top w:type="dxa" w:w="70"/>
+              <w:left w:type="dxa" w:w="120"/>
+              <w:bottom w:type="dxa" w:w="70"/>
+              <w:right w:type="dxa" w:w="120"/>
+            </w:tcMar>
+            <w:vAlign w:val="center"/>
+          </w:tcPr>
+          <w:p>
+            <w:pPr>
+              <w:jc w:val="left"/>
+            </w:pPr>
+            <w:r>
+              <w:rPr>
+                <w:rFonts w:ascii="Calibri" w:cs="Calibri" w:eastAsia="Calibri" w:hAnsi="Calibri"/>
+                <w:b/>
+                <w:bCs/>
+                <w:color w:val="1F3B5C"/>
+                <w:sz w:val="20"/>
+                <w:szCs w:val="20"/>
+              </w:rPr>
+              <w:t xml:space="preserve">F</w:t>
+            </w:r>
+          </w:p>
+        </w:tc>
+        <w:tc>
+          <w:tcPr>
+            <w:tcW w:type="dxa" w:w="1300"/>
+            <w:tcBorders>
+              <w:top w:val="single" w:color="D6E6F3" w:sz="4"/>
+              <w:left w:val="none" w:color="FFFFFF" w:sz="0"/>
+              <w:bottom w:val="single" w:color="D6E6F3" w:sz="4"/>
+              <w:right w:val="none" w:color="FFFFFF" w:sz="0"/>
+            </w:tcBorders>
+            <w:shd w:fill="EAF4FC" w:color="auto" w:val="clear"/>
+            <w:tcMar>
+              <w:top w:type="dxa" w:w="70"/>
+              <w:left w:type="dxa" w:w="120"/>
+              <w:bottom w:type="dxa" w:w="70"/>
+              <w:right w:type="dxa" w:w="120"/>
+            </w:tcMar>
+            <w:vAlign w:val="center"/>
+          </w:tcPr>
+          <w:p>
+            <w:pPr>
+              <w:jc w:val="center"/>
+            </w:pPr>
+            <w:r>
+              <w:rPr>
+                <w:rFonts w:ascii="Calibri" w:cs="Calibri" w:eastAsia="Calibri" w:hAnsi="Calibri"/>
+                <w:color w:val="222222"/>
+                <w:sz w:val="20"/>
+                <w:szCs w:val="20"/>
+              </w:rPr>
+              <w:t xml:space="preserve">159 €</w:t>
+            </w:r>
+          </w:p>
+        </w:tc>
+        <w:tc>
+          <w:tcPr>
+            <w:tcW w:type="dxa" w:w="1300"/>
+            <w:tcBorders>
+              <w:top w:val="single" w:color="D6E6F3" w:sz="4"/>
+              <w:left w:val="none" w:color="FFFFFF" w:sz="0"/>
+              <w:bottom w:val="single" w:color="D6E6F3" w:sz="4"/>
+              <w:right w:val="none" w:color="FFFFFF" w:sz="0"/>
+            </w:tcBorders>
+            <w:shd w:fill="EAF4FC" w:color="auto" w:val="clear"/>
+            <w:tcMar>
+              <w:top w:type="dxa" w:w="70"/>
+              <w:left w:type="dxa" w:w="120"/>
+              <w:bottom w:type="dxa" w:w="70"/>
+              <w:right w:type="dxa" w:w="120"/>
+            </w:tcMar>
+            <w:vAlign w:val="center"/>
+          </w:tcPr>
+          <w:p>
+            <w:pPr>
+              <w:jc w:val="center"/>
+            </w:pPr>
+            <w:r>
+              <w:rPr>
+                <w:rFonts w:ascii="Calibri" w:cs="Calibri" w:eastAsia="Calibri" w:hAnsi="Calibri"/>
+                <w:color w:val="222222"/>
+                <w:sz w:val="20"/>
+                <w:szCs w:val="20"/>
+              </w:rPr>
+              <w:t xml:space="preserve">189 €</w:t>
+            </w:r>
+          </w:p>
+        </w:tc>
+        <w:tc>
+          <w:tcPr>
+            <w:tcW w:type="dxa" w:w="1300"/>
+            <w:tcBorders>
+              <w:top w:val="single" w:color="D6E6F3" w:sz="4"/>
+              <w:left w:val="none" w:color="FFFFFF" w:sz="0"/>
+              <w:bottom w:val="single" w:color="D6E6F3" w:sz="4"/>
+              <w:right w:val="none" w:color="FFFFFF" w:sz="0"/>
+            </w:tcBorders>
+            <w:shd w:fill="EAF4FC" w:color="auto" w:val="clear"/>
+            <w:tcMar>
+              <w:top w:type="dxa" w:w="70"/>
+              <w:left w:type="dxa" w:w="120"/>
+              <w:bottom w:type="dxa" w:w="70"/>
+              <w:right w:type="dxa" w:w="120"/>
+            </w:tcMar>
+            <w:vAlign w:val="center"/>
+          </w:tcPr>
+          <w:p>
+            <w:pPr>
+              <w:jc w:val="center"/>
+            </w:pPr>
+            <w:r>
+              <w:rPr>
+                <w:rFonts w:ascii="Calibri" w:cs="Calibri" w:eastAsia="Calibri" w:hAnsi="Calibri"/>
+                <w:color w:val="222222"/>
+                <w:sz w:val="20"/>
+                <w:szCs w:val="20"/>
+              </w:rPr>
+              <w:t xml:space="preserve">219 €</w:t>
+            </w:r>
+          </w:p>
+        </w:tc>
+        <w:tc>
+          <w:tcPr>
+            <w:tcW w:type="dxa" w:w="1366"/>
+            <w:tcBorders>
+              <w:top w:val="single" w:color="D6E6F3" w:sz="4"/>
+              <w:left w:val="none" w:color="FFFFFF" w:sz="0"/>
+              <w:bottom w:val="single" w:color="D6E6F3" w:sz="4"/>
+              <w:right w:val="none" w:color="FFFFFF" w:sz="0"/>
+            </w:tcBorders>
+            <w:shd w:fill="EAF4FC" w:color="auto" w:val="clear"/>
+            <w:tcMar>
+              <w:top w:type="dxa" w:w="70"/>
+              <w:left w:type="dxa" w:w="120"/>
+              <w:bottom w:type="dxa" w:w="70"/>
+              <w:right w:type="dxa" w:w="120"/>
+            </w:tcMar>
+            <w:vAlign w:val="center"/>
+          </w:tcPr>
+          <w:p>
+            <w:pPr>
+              <w:jc w:val="center"/>
+            </w:pPr>
+            <w:r>
+              <w:rPr>
+                <w:rFonts w:ascii="Calibri" w:cs="Calibri" w:eastAsia="Calibri" w:hAnsi="Calibri"/>
+                <w:color w:val="222222"/>
+                <w:sz w:val="20"/>
+                <w:szCs w:val="20"/>
+              </w:rPr>
+              <w:t xml:space="preserve">209 €</w:t>
+            </w:r>
+          </w:p>
+        </w:tc>
+        <w:tc>
+          <w:tcPr>
+            <w:tcW w:type="dxa" w:w="1366"/>
+            <w:tcBorders>
+              <w:top w:val="single" w:color="D6E6F3" w:sz="4"/>
+              <w:left w:val="none" w:color="FFFFFF" w:sz="0"/>
+              <w:bottom w:val="single" w:color="D6E6F3" w:sz="4"/>
+              <w:right w:val="none" w:color="FFFFFF" w:sz="0"/>
+            </w:tcBorders>
+            <w:shd w:fill="EAF4FC" w:color="auto" w:val="clear"/>
+            <w:tcMar>
+              <w:top w:type="dxa" w:w="70"/>
+              <w:left w:type="dxa" w:w="120"/>
+              <w:bottom w:type="dxa" w:w="70"/>
+              <w:right w:type="dxa" w:w="120"/>
+            </w:tcMar>
+            <w:vAlign w:val="center"/>
+          </w:tcPr>
+          <w:p>
+            <w:pPr>
+              <w:jc w:val="center"/>
+            </w:pPr>
+            <w:r>
+              <w:rPr>
+                <w:rFonts w:ascii="Calibri" w:cs="Calibri" w:eastAsia="Calibri" w:hAnsi="Calibri"/>
+                <w:color w:val="222222"/>
+                <w:sz w:val="20"/>
+                <w:szCs w:val="20"/>
+              </w:rPr>
+              <w:t xml:space="preserve">239 €</w:t>
+            </w:r>
+          </w:p>
+        </w:tc>
+        <w:tc>
+          <w:tcPr>
+            <w:tcW w:type="dxa" w:w="1368"/>
+            <w:tcBorders>
+              <w:top w:val="single" w:color="D6E6F3" w:sz="4"/>
+              <w:left w:val="none" w:color="FFFFFF" w:sz="0"/>
+              <w:bottom w:val="single" w:color="D6E6F3" w:sz="4"/>
+              <w:right w:val="none" w:color="FFFFFF" w:sz="0"/>
+            </w:tcBorders>
+            <w:shd w:fill="EAF4FC" w:color="auto" w:val="clear"/>
+            <w:tcMar>
+              <w:top w:type="dxa" w:w="70"/>
+              <w:left w:type="dxa" w:w="120"/>
+              <w:bottom w:type="dxa" w:w="70"/>
+              <w:right w:type="dxa" w:w="120"/>
+            </w:tcMar>
+            <w:vAlign w:val="center"/>
+          </w:tcPr>
+          <w:p>
+            <w:pPr>
+              <w:jc w:val="center"/>
+            </w:pPr>
+            <w:r>
+              <w:rPr>
+                <w:rFonts w:ascii="Calibri" w:cs="Calibri" w:eastAsia="Calibri" w:hAnsi="Calibri"/>
+                <w:color w:val="222222"/>
+                <w:sz w:val="20"/>
+                <w:szCs w:val="20"/>
+              </w:rPr>
+              <w:t xml:space="preserve">259 €</w:t>
             </w:r>
           </w:p>
         </w:tc>
@@ -2922,51 +3736,6 @@
           <w:szCs w:val="22"/>
         </w:rPr>
         <w:t xml:space="preserve">Las primas incluyen el impuesto sobre las primas de seguro. Los pacientes ya asegurados mantienen su póliza sin cambios hasta el final de su vigencia.</w:t>
-      </w:r>
-    </w:p>
-    <w:p>
-      <w:pPr>
-        <w:keepNext/>
-        <w:keepLines/>
-        <w:pBdr>
-          <w:bottom w:val="single" w:color="61B2E7" w:sz="6" w:space="3"/>
-        </w:pBdr>
-        <w:spacing w:after="120" w:before="260"/>
-      </w:pPr>
-      <w:r>
-        <w:rPr>
-          <w:rFonts w:ascii="Calibri" w:cs="Calibri" w:eastAsia="Calibri" w:hAnsi="Calibri"/>
-          <w:b/>
-          <w:bCs/>
-          <w:color w:val="61B2E7"/>
-          <w:sz w:val="26"/>
-          <w:szCs w:val="26"/>
-        </w:rPr>
-        <w:t xml:space="preserve">4  </w:t>
-      </w:r>
-      <w:r>
-        <w:rPr>
-          <w:rFonts w:ascii="Calibri" w:cs="Calibri" w:eastAsia="Calibri" w:hAnsi="Calibri"/>
-          <w:b/>
-          <w:bCs/>
-          <w:color w:val="1F3B5C"/>
-          <w:sz w:val="26"/>
-          <w:szCs w:val="26"/>
-        </w:rPr>
-        <w:t xml:space="preserve">Qué tienen que hacer</w:t>
-      </w:r>
-    </w:p>
-    <w:p>
-      <w:pPr>
-        <w:spacing w:after="140" w:line="276"/>
-      </w:pPr>
-      <w:r>
-        <w:rPr>
-          <w:rFonts w:ascii="Calibri" w:cs="Calibri" w:eastAsia="Calibri" w:hAnsi="Calibri"/>
-          <w:sz w:val="22"/>
-          <w:szCs w:val="22"/>
-        </w:rPr>
-        <w:t xml:space="preserve">A partir del 1 de enero de 2027, basta con que entreguen a sus pacientes el formulario de solicitud adjunto o les indiquen que pueden contratar en medassure.es. Recuerden que el seguro debe contratarse antes de la operación.</w:t>
       </w:r>
     </w:p>
     <w:tbl>

</xml_diff>

<commit_message>
Carta medassure beauty: opción de seguir pagando la prima desde la clínica
Quien prefiera pagar la prima puede indicar su IBAN en el formulario de
solicitud y firmarlo como titular de la cuenta; la prima de cada paciente se
carga al tramitar su solicitud.

Co-Authored-By: Claude Opus 5.5 <noreply@anthropic.com>
Claude-Session: https://claude.ai/code/session_01BbVdXybygTjqWXzNsPXUcQ
</commit_message>
<xml_diff>
--- a/medassure_beauty_Carta_clientes_ES.docx
+++ b/medassure_beauty_Carta_clientes_ES.docx
@@ -479,7 +479,37 @@
           <w:sz w:val="22"/>
           <w:szCs w:val="22"/>
         </w:rPr>
-        <w:t xml:space="preserve">En los dos casos, el propio paciente paga la prima y gestiona el seguro con nosotros. Usted ya no tendrá que encargarse del cobro ni de la facturación. Muchos médicos y clínicas utilizan ya este formulario y la valoración es muy positiva.</w:t>
+        <w:t xml:space="preserve">En los dos casos, el seguro queda a nombre del paciente, que lo gestiona directamente con nosotros. Si es el paciente quien paga la prima, usted ya no tendrá que encargarse del cobro ni de la facturación. Muchos médicos y clínicas utilizan ya este formulario y la valoración es muy positiva.</w:t>
+      </w:r>
+    </w:p>
+    <w:p>
+      <w:pPr>
+        <w:keepNext/>
+        <w:spacing w:before="60" w:after="80" w:line="276"/>
+      </w:pPr>
+      <w:r>
+        <w:rPr>
+          <w:rFonts w:ascii="Calibri" w:cs="Calibri" w:eastAsia="Calibri" w:hAnsi="Calibri"/>
+          <w:b/>
+          <w:bCs/>
+          <w:color w:val="1F3B5C"/>
+          <w:sz w:val="22"/>
+          <w:szCs w:val="22"/>
+        </w:rPr>
+        <w:t xml:space="preserve">Si prefiere seguir pagando usted la prima</w:t>
+      </w:r>
+    </w:p>
+    <w:p>
+      <w:pPr>
+        <w:spacing w:after="140" w:line="276"/>
+      </w:pPr>
+      <w:r>
+        <w:rPr>
+          <w:rFonts w:ascii="Calibri" w:cs="Calibri" w:eastAsia="Calibri" w:hAnsi="Calibri"/>
+          <w:sz w:val="22"/>
+          <w:szCs w:val="22"/>
+        </w:rPr>
+        <w:t xml:space="preserve">También puede seguir pagando la prima desde su clínica o consulta. Basta con indicar su IBAN en el apartado de domiciliación del formulario de solicitud y firmarlo también como titular de la cuenta. Cargaremos en su cuenta la prima de cada paciente al tramitar su solicitud.</w:t>
       </w:r>
     </w:p>
     <w:p>

</xml_diff>